<commit_message>
Use supplied app icon replicas in courses and manuals
</commit_message>
<xml_diff>
--- a/cursos/informatica/manual/Manual_Informatica_Modulo1.docx
+++ b/cursos/informatica/manual/Manual_Informatica_Modulo1.docx
@@ -3140,6 +3140,330 @@
         <w:spacing w:after="100"/>
       </w:pPr>
     </w:p>
+    <w:p>
+      <w:pPr>
+        <w:keepNext/>
+        <w:spacing w:before="160" w:after="80"/>
+      </w:pPr>
+      <w:r>
+        <w:rPr>
+          <w:b/>
+          <w:color w:val="102B43"/>
+          <w:sz w:val="26"/>
+        </w:rPr>
+        <w:t>1.7 Reconhecer os ícones dos programas</w:t>
+      </w:r>
+    </w:p>
+    <w:p>
+      <w:pPr>
+        <w:keepNext/>
+        <w:spacing w:after="100"/>
+      </w:pPr>
+      <w:r>
+        <w:t>Os ícones seguintes ajudam a reconhecer o Windows e as aplicações Office abordadas no curso. A aparência pode variar entre versões; confirme o nome apresentado no computador.</w:t>
+      </w:r>
+    </w:p>
+    <w:tbl>
+      <w:tblPr>
+        <w:tblW w:type="auto" w:w="0"/>
+        <w:tblLayout w:type="fixed"/>
+        <w:tblLook w:firstColumn="1" w:firstRow="1" w:lastColumn="0" w:lastRow="0" w:noHBand="0" w:noVBand="1" w:val="04A0"/>
+      </w:tblPr>
+      <w:tblGrid>
+        <w:gridCol w:w="1928"/>
+        <w:gridCol w:w="1928"/>
+        <w:gridCol w:w="1928"/>
+        <w:gridCol w:w="1928"/>
+        <w:gridCol w:w="1928"/>
+      </w:tblGrid>
+      <w:tr>
+        <w:tc>
+          <w:tcPr>
+            <w:tcW w:type="dxa" w:w="1584"/>
+            <w:vAlign w:val="center"/>
+          </w:tcPr>
+          <w:p>
+            <w:pPr>
+              <w:jc w:val="center"/>
+            </w:pPr>
+            <w:r>
+              <w:drawing>
+                <wp:inline xmlns:a="http://schemas.openxmlformats.org/drawingml/2006/main" xmlns:pic="http://schemas.openxmlformats.org/drawingml/2006/picture">
+                  <wp:extent cx="621792" cy="621792"/>
+                  <wp:docPr id="2" name="Picture 2" descr="Windows — réplica visual de identificação"/>
+                  <wp:cNvGraphicFramePr>
+                    <a:graphicFrameLocks noChangeAspect="1"/>
+                  </wp:cNvGraphicFramePr>
+                  <a:graphic>
+                    <a:graphicData uri="http://schemas.openxmlformats.org/drawingml/2006/picture">
+                      <pic:pic>
+                        <pic:nvPicPr>
+                          <pic:cNvPr id="0" name="windows-replica.png"/>
+                          <pic:cNvPicPr/>
+                        </pic:nvPicPr>
+                        <pic:blipFill>
+                          <a:blip r:embed="rId23"/>
+                          <a:stretch>
+                            <a:fillRect/>
+                          </a:stretch>
+                        </pic:blipFill>
+                        <pic:spPr>
+                          <a:xfrm>
+                            <a:off x="0" y="0"/>
+                            <a:ext cx="621792" cy="621792"/>
+                          </a:xfrm>
+                          <a:prstGeom prst="rect"/>
+                        </pic:spPr>
+                      </pic:pic>
+                    </a:graphicData>
+                  </a:graphic>
+                </wp:inline>
+              </w:drawing>
+            </w:r>
+          </w:p>
+          <w:p>
+            <w:pPr>
+              <w:jc w:val="center"/>
+            </w:pPr>
+            <w:r>
+              <w:rPr>
+                <w:b/>
+                <w:sz w:val="14"/>
+              </w:rPr>
+              <w:t>Windows</w:t>
+            </w:r>
+          </w:p>
+        </w:tc>
+        <w:tc>
+          <w:tcPr>
+            <w:tcW w:type="dxa" w:w="1584"/>
+            <w:vAlign w:val="center"/>
+          </w:tcPr>
+          <w:p>
+            <w:pPr>
+              <w:jc w:val="center"/>
+            </w:pPr>
+            <w:r>
+              <w:drawing>
+                <wp:inline xmlns:a="http://schemas.openxmlformats.org/drawingml/2006/main" xmlns:pic="http://schemas.openxmlformats.org/drawingml/2006/picture">
+                  <wp:extent cx="621792" cy="621792"/>
+                  <wp:docPr id="3" name="Picture 3" descr="Microsoft Word — réplica visual de identificação"/>
+                  <wp:cNvGraphicFramePr>
+                    <a:graphicFrameLocks noChangeAspect="1"/>
+                  </wp:cNvGraphicFramePr>
+                  <a:graphic>
+                    <a:graphicData uri="http://schemas.openxmlformats.org/drawingml/2006/picture">
+                      <pic:pic>
+                        <pic:nvPicPr>
+                          <pic:cNvPr id="0" name="image.png"/>
+                          <pic:cNvPicPr/>
+                        </pic:nvPicPr>
+                        <pic:blipFill>
+                          <a:blip r:embed="rId19"/>
+                          <a:stretch>
+                            <a:fillRect/>
+                          </a:stretch>
+                        </pic:blipFill>
+                        <pic:spPr>
+                          <a:xfrm>
+                            <a:off x="0" y="0"/>
+                            <a:ext cx="621792" cy="621792"/>
+                          </a:xfrm>
+                          <a:prstGeom prst="rect"/>
+                        </pic:spPr>
+                      </pic:pic>
+                    </a:graphicData>
+                  </a:graphic>
+                </wp:inline>
+              </w:drawing>
+            </w:r>
+          </w:p>
+          <w:p>
+            <w:pPr>
+              <w:jc w:val="center"/>
+            </w:pPr>
+            <w:r>
+              <w:rPr>
+                <w:b/>
+                <w:sz w:val="14"/>
+              </w:rPr>
+              <w:t>Microsoft Word</w:t>
+            </w:r>
+          </w:p>
+        </w:tc>
+        <w:tc>
+          <w:tcPr>
+            <w:tcW w:type="dxa" w:w="1584"/>
+            <w:vAlign w:val="center"/>
+          </w:tcPr>
+          <w:p>
+            <w:pPr>
+              <w:jc w:val="center"/>
+            </w:pPr>
+            <w:r>
+              <w:drawing>
+                <wp:inline xmlns:a="http://schemas.openxmlformats.org/drawingml/2006/main" xmlns:pic="http://schemas.openxmlformats.org/drawingml/2006/picture">
+                  <wp:extent cx="621792" cy="621792"/>
+                  <wp:docPr id="4" name="Picture 4" descr="Microsoft Excel — réplica visual de identificação"/>
+                  <wp:cNvGraphicFramePr>
+                    <a:graphicFrameLocks noChangeAspect="1"/>
+                  </wp:cNvGraphicFramePr>
+                  <a:graphic>
+                    <a:graphicData uri="http://schemas.openxmlformats.org/drawingml/2006/picture">
+                      <pic:pic>
+                        <pic:nvPicPr>
+                          <pic:cNvPr id="0" name="image.png"/>
+                          <pic:cNvPicPr/>
+                        </pic:nvPicPr>
+                        <pic:blipFill>
+                          <a:blip r:embed="rId20"/>
+                          <a:stretch>
+                            <a:fillRect/>
+                          </a:stretch>
+                        </pic:blipFill>
+                        <pic:spPr>
+                          <a:xfrm>
+                            <a:off x="0" y="0"/>
+                            <a:ext cx="621792" cy="621792"/>
+                          </a:xfrm>
+                          <a:prstGeom prst="rect"/>
+                        </pic:spPr>
+                      </pic:pic>
+                    </a:graphicData>
+                  </a:graphic>
+                </wp:inline>
+              </w:drawing>
+            </w:r>
+          </w:p>
+          <w:p>
+            <w:pPr>
+              <w:jc w:val="center"/>
+            </w:pPr>
+            <w:r>
+              <w:rPr>
+                <w:b/>
+                <w:sz w:val="14"/>
+              </w:rPr>
+              <w:t>Microsoft Excel</w:t>
+            </w:r>
+          </w:p>
+        </w:tc>
+        <w:tc>
+          <w:tcPr>
+            <w:tcW w:type="dxa" w:w="1584"/>
+            <w:vAlign w:val="center"/>
+          </w:tcPr>
+          <w:p>
+            <w:pPr>
+              <w:jc w:val="center"/>
+            </w:pPr>
+            <w:r>
+              <w:drawing>
+                <wp:inline xmlns:a="http://schemas.openxmlformats.org/drawingml/2006/main" xmlns:pic="http://schemas.openxmlformats.org/drawingml/2006/picture">
+                  <wp:extent cx="621792" cy="621792"/>
+                  <wp:docPr id="5" name="Picture 5" descr="Microsoft PowerPoint — réplica visual de identificação"/>
+                  <wp:cNvGraphicFramePr>
+                    <a:graphicFrameLocks noChangeAspect="1"/>
+                  </wp:cNvGraphicFramePr>
+                  <a:graphic>
+                    <a:graphicData uri="http://schemas.openxmlformats.org/drawingml/2006/picture">
+                      <pic:pic>
+                        <pic:nvPicPr>
+                          <pic:cNvPr id="0" name="image.png"/>
+                          <pic:cNvPicPr/>
+                        </pic:nvPicPr>
+                        <pic:blipFill>
+                          <a:blip r:embed="rId21"/>
+                          <a:stretch>
+                            <a:fillRect/>
+                          </a:stretch>
+                        </pic:blipFill>
+                        <pic:spPr>
+                          <a:xfrm>
+                            <a:off x="0" y="0"/>
+                            <a:ext cx="621792" cy="621792"/>
+                          </a:xfrm>
+                          <a:prstGeom prst="rect"/>
+                        </pic:spPr>
+                      </pic:pic>
+                    </a:graphicData>
+                  </a:graphic>
+                </wp:inline>
+              </w:drawing>
+            </w:r>
+          </w:p>
+          <w:p>
+            <w:pPr>
+              <w:jc w:val="center"/>
+            </w:pPr>
+            <w:r>
+              <w:rPr>
+                <w:b/>
+                <w:sz w:val="14"/>
+              </w:rPr>
+              <w:t>Microsoft PowerPoint</w:t>
+            </w:r>
+          </w:p>
+        </w:tc>
+        <w:tc>
+          <w:tcPr>
+            <w:tcW w:type="dxa" w:w="1584"/>
+            <w:vAlign w:val="center"/>
+          </w:tcPr>
+          <w:p>
+            <w:pPr>
+              <w:jc w:val="center"/>
+            </w:pPr>
+            <w:r>
+              <w:drawing>
+                <wp:inline xmlns:a="http://schemas.openxmlformats.org/drawingml/2006/main" xmlns:pic="http://schemas.openxmlformats.org/drawingml/2006/picture">
+                  <wp:extent cx="621792" cy="621792"/>
+                  <wp:docPr id="6" name="Picture 6" descr="Microsoft Outlook — réplica visual de identificação"/>
+                  <wp:cNvGraphicFramePr>
+                    <a:graphicFrameLocks noChangeAspect="1"/>
+                  </wp:cNvGraphicFramePr>
+                  <a:graphic>
+                    <a:graphicData uri="http://schemas.openxmlformats.org/drawingml/2006/picture">
+                      <pic:pic>
+                        <pic:nvPicPr>
+                          <pic:cNvPr id="0" name="image.png"/>
+                          <pic:cNvPicPr/>
+                        </pic:nvPicPr>
+                        <pic:blipFill>
+                          <a:blip r:embed="rId22"/>
+                          <a:stretch>
+                            <a:fillRect/>
+                          </a:stretch>
+                        </pic:blipFill>
+                        <pic:spPr>
+                          <a:xfrm>
+                            <a:off x="0" y="0"/>
+                            <a:ext cx="621792" cy="621792"/>
+                          </a:xfrm>
+                          <a:prstGeom prst="rect"/>
+                        </pic:spPr>
+                      </pic:pic>
+                    </a:graphicData>
+                  </a:graphic>
+                </wp:inline>
+              </w:drawing>
+            </w:r>
+          </w:p>
+          <w:p>
+            <w:pPr>
+              <w:jc w:val="center"/>
+            </w:pPr>
+            <w:r>
+              <w:rPr>
+                <w:b/>
+                <w:sz w:val="14"/>
+              </w:rPr>
+              <w:t>Microsoft Outlook</w:t>
+            </w:r>
+          </w:p>
+        </w:tc>
+      </w:tr>
+    </w:tbl>
     <w:p>
       <w:pPr>
         <w:pStyle w:val="Heading2"/>

</xml_diff>